<commit_message>
feat: implement account settings, NextAuth credentials auth integration, and optimize UI performance and animations
</commit_message>
<xml_diff>
--- a/docs/Billora_Feature_Status_Checklist.docx
+++ b/docs/Billora_Feature_Status_Checklist.docx
@@ -15,7 +15,7 @@
         <w:rPr>
           <w:i/>
         </w:rPr>
-        <w:t>Living document — updated after every significant change. Latest check: post premium-polish pass (Billora-update_28).</w:t>
+        <w:t>Living document — updated after every significant change. Latest check: post settings &amp; auth integration pass.</w:t>
         <w:br/>
         <w:br/>
       </w:r>
@@ -125,7 +125,7 @@
           </w:tcPr>
           <w:p>
             <w:r>
-              <w:t>Hero, stats, and feature blocks render. Primary CTAs link to /login. Mouse-reactive 3D tilt, glass reflection on the hero card, drifting particles, scroll-reactive navbar blur. Notes point to /login, but /login has no working auth yet.</w:t>
+              <w:t>Hero, stats, and feature blocks render. Primary CTAs link to /login. Mouse-reactive 3D tilt, glass reflection on the hero card, drifting particles, scroll-reactive navbar blur.</w:t>
             </w:r>
           </w:p>
         </w:tc>
@@ -431,7 +431,7 @@
           </w:tcPr>
           <w:p>
             <w:r>
-              <w:t>⚠ Partially built</w:t>
+              <w:t>✅ Built</w:t>
             </w:r>
           </w:p>
         </w:tc>
@@ -441,7 +441,71 @@
           </w:tcPr>
           <w:p>
             <w:r>
-              <w:t>Tab switching, validation, and simulated submit/redirect flow work. API routes (/api/auth/*) are stubs.</w:t>
+              <w:t>Full credentials authentication using email and password. Fully functional login/logout redirects based on session state.</w:t>
+            </w:r>
+          </w:p>
+        </w:tc>
+      </w:tr>
+      <w:tr>
+        <w:tc>
+          <w:tcPr>
+            <w:tcW w:type="dxa" w:w="2880"/>
+          </w:tcPr>
+          <w:p>
+            <w:r>
+              <w:t>Account Settings Page</w:t>
+            </w:r>
+          </w:p>
+        </w:tc>
+        <w:tc>
+          <w:tcPr>
+            <w:tcW w:type="dxa" w:w="1728"/>
+          </w:tcPr>
+          <w:p>
+            <w:r>
+              <w:t>✅ Built</w:t>
+            </w:r>
+          </w:p>
+        </w:tc>
+        <w:tc>
+          <w:tcPr>
+            <w:tcW w:type="dxa" w:w="5472"/>
+          </w:tcPr>
+          <w:p>
+            <w:r>
+              <w:t>Allows signed-in users to update their profile (name, business name) and securely change their password (with current password verification).</w:t>
+            </w:r>
+          </w:p>
+        </w:tc>
+      </w:tr>
+      <w:tr>
+        <w:tc>
+          <w:tcPr>
+            <w:tcW w:type="dxa" w:w="2880"/>
+          </w:tcPr>
+          <w:p>
+            <w:r>
+              <w:t>Account Menu / Avatar Dropdown</w:t>
+            </w:r>
+          </w:p>
+        </w:tc>
+        <w:tc>
+          <w:tcPr>
+            <w:tcW w:type="dxa" w:w="1728"/>
+          </w:tcPr>
+          <w:p>
+            <w:r>
+              <w:t>✅ Built</w:t>
+            </w:r>
+          </w:p>
+        </w:tc>
+        <w:tc>
+          <w:tcPr>
+            <w:tcW w:type="dxa" w:w="5472"/>
+          </w:tcPr>
+          <w:p>
+            <w:r>
+              <w:t>AppTopBar dropdown displaying signed-in user's initials, name, and email. Provides quick links to Account Settings and triggers NextAuth sign-out.</w:t>
             </w:r>
           </w:p>
         </w:tc>
@@ -655,7 +719,7 @@
         <w:pStyle w:val="Heading2"/>
       </w:pPr>
       <w:r>
-        <w:t>Authentication</w:t>
+        <w:t>Authentication &amp; User API</w:t>
       </w:r>
     </w:p>
     <w:tbl>
@@ -727,7 +791,7 @@
           </w:tcPr>
           <w:p>
             <w:r>
-              <w:t>⚠ Partially built</w:t>
+              <w:t>✅ Built</w:t>
             </w:r>
           </w:p>
         </w:tc>
@@ -737,7 +801,39 @@
           </w:tcPr>
           <w:p>
             <w:r>
-              <w:t>Session folders and endpoints are declared, but API routes under /api/auth/* are still stubs. Needs password hashing, session tokens, and database user lookups.</w:t>
+              <w:t>Implemented JWT session strategy. Wired Credentials provider verifying user against Prisma database. Safe JWT callbacks handle update triggers to sync navbar &amp; profile edits without re-login.</w:t>
+            </w:r>
+          </w:p>
+        </w:tc>
+      </w:tr>
+      <w:tr>
+        <w:tc>
+          <w:tcPr>
+            <w:tcW w:type="dxa" w:w="2880"/>
+          </w:tcPr>
+          <w:p>
+            <w:r>
+              <w:t>User Profile API (/api/user)</w:t>
+            </w:r>
+          </w:p>
+        </w:tc>
+        <w:tc>
+          <w:tcPr>
+            <w:tcW w:type="dxa" w:w="1728"/>
+          </w:tcPr>
+          <w:p>
+            <w:r>
+              <w:t>✅ Built</w:t>
+            </w:r>
+          </w:p>
+        </w:tc>
+        <w:tc>
+          <w:tcPr>
+            <w:tcW w:type="dxa" w:w="5472"/>
+          </w:tcPr>
+          <w:p>
+            <w:r>
+              <w:t>GET profile details (excluding password) and PATCH update details (supporting name, business, and secure bcrypt password updates).</w:t>
             </w:r>
           </w:p>
         </w:tc>

</xml_diff>

<commit_message>
feat: integrate database-backed CRUD endpoints for Invoices, Customers, Estimates, and Expenses with full app dashboard syncing and apply prisma migrations
</commit_message>
<xml_diff>
--- a/docs/Billora_Feature_Status_Checklist.docx
+++ b/docs/Billora_Feature_Status_Checklist.docx
@@ -15,7 +15,7 @@
         <w:rPr>
           <w:i/>
         </w:rPr>
-        <w:t>Living document — updated after every significant change. Latest check: post settings &amp; auth integration pass.</w:t>
+        <w:t>Living document — updated after every significant change. Latest check: post database crud integration pass.</w:t>
         <w:br/>
         <w:br/>
       </w:r>
@@ -527,7 +527,7 @@
           </w:tcPr>
           <w:p>
             <w:r>
-              <w:t>⚠ Partially built</w:t>
+              <w:t>✅ Built</w:t>
             </w:r>
           </w:p>
         </w:tc>
@@ -537,7 +537,7 @@
           </w:tcPr>
           <w:p>
             <w:r>
-              <w:t>App Dashboard uses mock data (src/lib/mockData.ts). Mock dashboard preview flips statuses (Pending -&gt; Paid) and count-ups dynamically.</w:t>
+              <w:t>Dashboard home screen fully connected to database APIs. Dynamically compiles KPIs (Revenue, Invoices, Customers, Pending Estimates) and displays recent lists from database.</w:t>
             </w:r>
           </w:p>
         </w:tc>
@@ -559,7 +559,7 @@
           </w:tcPr>
           <w:p>
             <w:r>
-              <w:t>⚠ Partially built</w:t>
+              <w:t>✅ Built</w:t>
             </w:r>
           </w:p>
         </w:tc>
@@ -569,7 +569,39 @@
           </w:tcPr>
           <w:p>
             <w:r>
-              <w:t>Search, filters, line items, tax %, simulated save, and quick-add modals work in-browser. Backed by mock data; API routes are stubs.</w:t>
+              <w:t>Full invoice management workflows. Creates new invoices, updates statuses, edits line items, adds custom notes/tax, and tracks customers—all synced to PostgreSQL via database APIs.</w:t>
+            </w:r>
+          </w:p>
+        </w:tc>
+      </w:tr>
+      <w:tr>
+        <w:tc>
+          <w:tcPr>
+            <w:tcW w:type="dxa" w:w="2880"/>
+          </w:tcPr>
+          <w:p>
+            <w:r>
+              <w:t>Customer Management</w:t>
+            </w:r>
+          </w:p>
+        </w:tc>
+        <w:tc>
+          <w:tcPr>
+            <w:tcW w:type="dxa" w:w="1728"/>
+          </w:tcPr>
+          <w:p>
+            <w:r>
+              <w:t>✅ Built</w:t>
+            </w:r>
+          </w:p>
+        </w:tc>
+        <w:tc>
+          <w:tcPr>
+            <w:tcW w:type="dxa" w:w="5472"/>
+          </w:tcPr>
+          <w:p>
+            <w:r>
+              <w:t>Displays customers, handles search, and enables adding or editing clients dynamically with data saved to database.</w:t>
             </w:r>
           </w:p>
         </w:tc>
@@ -591,7 +623,7 @@
           </w:tcPr>
           <w:p>
             <w:r>
-              <w:t>⚠ Partially built</w:t>
+              <w:t>✅ Built</w:t>
             </w:r>
           </w:p>
         </w:tc>
@@ -601,7 +633,7 @@
           </w:tcPr>
           <w:p>
             <w:r>
-              <w:t>Status views, filter settings, list views, and simulated expense additions. Backed by mock data.</w:t>
+              <w:t>Estimates list + creation, and Expenses category tracking + entry logging now pull from and save to PostgreSQL database through dedicated APIs.</w:t>
             </w:r>
           </w:p>
         </w:tc>
@@ -917,7 +949,7 @@
           </w:tcPr>
           <w:p>
             <w:r>
-              <w:t>⚠ Partially built</w:t>
+              <w:t>✅ Built</w:t>
             </w:r>
           </w:p>
         </w:tc>
@@ -927,7 +959,39 @@
           </w:tcPr>
           <w:p>
             <w:r>
-              <w:t>Endpoints return stub responses instead of interacting with Prisma client. Needs SQL/Prisma implementation for listing, creating, and updating.</w:t>
+              <w:t>Fully operational database GET and POST endpoints. Computes invoice totals dynamically and enforces ownership constraints.</w:t>
+            </w:r>
+          </w:p>
+        </w:tc>
+      </w:tr>
+      <w:tr>
+        <w:tc>
+          <w:tcPr>
+            <w:tcW w:type="dxa" w:w="2880"/>
+          </w:tcPr>
+          <w:p>
+            <w:r>
+              <w:t>Invoices Detail API (/api/invoices/[id])</w:t>
+            </w:r>
+          </w:p>
+        </w:tc>
+        <w:tc>
+          <w:tcPr>
+            <w:tcW w:type="dxa" w:w="1728"/>
+          </w:tcPr>
+          <w:p>
+            <w:r>
+              <w:t>✅ Built</w:t>
+            </w:r>
+          </w:p>
+        </w:tc>
+        <w:tc>
+          <w:tcPr>
+            <w:tcW w:type="dxa" w:w="5472"/>
+          </w:tcPr>
+          <w:p>
+            <w:r>
+              <w:t>Allows individual invoice retrieval, PATCH updates (supports complete line items transaction-safe replacements), and DELETE actions.</w:t>
             </w:r>
           </w:p>
         </w:tc>
@@ -949,7 +1013,7 @@
           </w:tcPr>
           <w:p>
             <w:r>
-              <w:t>⚠ Partially built</w:t>
+              <w:t>✅ Built</w:t>
             </w:r>
           </w:p>
         </w:tc>
@@ -959,7 +1023,7 @@
           </w:tcPr>
           <w:p>
             <w:r>
-              <w:t>Endpoint exists but returns stub data. Needs full database CRUD support.</w:t>
+              <w:t>GET list and POST creation endpoints to manage user-owned customer entries.</w:t>
             </w:r>
           </w:p>
         </w:tc>
@@ -971,7 +1035,7 @@
           </w:tcPr>
           <w:p>
             <w:r>
-              <w:t>Estimates &amp; Expenses APIs</w:t>
+              <w:t>Customers Detail API (/api/customers/[id])</w:t>
             </w:r>
           </w:p>
         </w:tc>
@@ -981,7 +1045,7 @@
           </w:tcPr>
           <w:p>
             <w:r>
-              <w:t>⚠ Partially built</w:t>
+              <w:t>✅ Built</w:t>
             </w:r>
           </w:p>
         </w:tc>
@@ -991,7 +1055,71 @@
           </w:tcPr>
           <w:p>
             <w:r>
-              <w:t>Endpoint stubs exist. Needs db queries integrated.</w:t>
+              <w:t>GET customer details, PATCH edit fields, and DELETE customer entries from database.</w:t>
+            </w:r>
+          </w:p>
+        </w:tc>
+      </w:tr>
+      <w:tr>
+        <w:tc>
+          <w:tcPr>
+            <w:tcW w:type="dxa" w:w="2880"/>
+          </w:tcPr>
+          <w:p>
+            <w:r>
+              <w:t>Estimates API (/api/estimates)</w:t>
+            </w:r>
+          </w:p>
+        </w:tc>
+        <w:tc>
+          <w:tcPr>
+            <w:tcW w:type="dxa" w:w="1728"/>
+          </w:tcPr>
+          <w:p>
+            <w:r>
+              <w:t>✅ Built</w:t>
+            </w:r>
+          </w:p>
+        </w:tc>
+        <w:tc>
+          <w:tcPr>
+            <w:tcW w:type="dxa" w:w="5472"/>
+          </w:tcPr>
+          <w:p>
+            <w:r>
+              <w:t>Fully database-integrated GET and POST endpoints. Generates next estimate numbers dynamically and associates customers.</w:t>
+            </w:r>
+          </w:p>
+        </w:tc>
+      </w:tr>
+      <w:tr>
+        <w:tc>
+          <w:tcPr>
+            <w:tcW w:type="dxa" w:w="2880"/>
+          </w:tcPr>
+          <w:p>
+            <w:r>
+              <w:t>Expenses API (/api/expenses)</w:t>
+            </w:r>
+          </w:p>
+        </w:tc>
+        <w:tc>
+          <w:tcPr>
+            <w:tcW w:type="dxa" w:w="1728"/>
+          </w:tcPr>
+          <w:p>
+            <w:r>
+              <w:t>✅ Built</w:t>
+            </w:r>
+          </w:p>
+        </w:tc>
+        <w:tc>
+          <w:tcPr>
+            <w:tcW w:type="dxa" w:w="5472"/>
+          </w:tcPr>
+          <w:p>
+            <w:r>
+              <w:t>Supports listing and creation of expenses mapped directly to Prisma tables.</w:t>
             </w:r>
           </w:p>
         </w:tc>
@@ -1287,7 +1415,7 @@
           </w:tcPr>
           <w:p>
             <w:r>
-              <w:t>Migrations successfully run and schema is fully up to date on Neon instance.</w:t>
+              <w:t>Migrations successfully run and schema is fully up to date on Neon instance (applied '20260726045750_customer_company_estimate_shape').</w:t>
             </w:r>
           </w:p>
         </w:tc>

</xml_diff>